<commit_message>
Fix abstract overclaim: DQM ~15x fewer nodes vs FDM and LINEAR FEM
The 2026-08-24 abstract shortening compressed the node-count claim to
competing-methods, which wrongly implied DQM beats quadratic FEM too.
The T2 benchmark shows quadratic FEM is comparably efficient (sometimes
better per node). Restored the finite-difference-and-linear-FEM
qualifier, matching Chapter 5 wording which was always correct.
FA + EN, docx regenerated.
</commit_message>
<xml_diff>
--- a/claude/thesis_chapter/ABSTRACT_FA.docx
+++ b/claude/thesis_chapter/ABSTRACT_FA.docx
@@ -299,19 +299,19 @@
         <w:rPr>
           <w:rtl/>
         </w:rPr>
-        <w:t xml:space="preserve">نیومارک با هزینهٔ محاسباتیِ کم (حدودِ یک‌پانزدهمِ نقاطِ روش‌های رقیب) به دقتِ</w:t>
-      </w:r>
-      <w:r>
-        <w:rPr>
-          <w:rtl/>
-        </w:rPr>
-        <w:t xml:space="preserve"> </w:t>
-      </w:r>
-      <w:r>
-        <w:rPr>
-          <w:rtl/>
-        </w:rPr>
-        <w:t xml:space="preserve">مطلوب می‌رسد.</w:t>
+        <w:t xml:space="preserve">نیومارک با هزینهٔ محاسباتیِ کم (حدودِ یک‌پانزدهمِ نقاطِ روشِ تفاضلِ محدود و</w:t>
+      </w:r>
+      <w:r>
+        <w:rPr>
+          <w:rtl/>
+        </w:rPr>
+        <w:t xml:space="preserve"> </w:t>
+      </w:r>
+      <w:r>
+        <w:rPr>
+          <w:rtl/>
+        </w:rPr>
+        <w:t xml:space="preserve">اجزای محدودِ خطی) به دقتِ مطلوب می‌رسد.</w:t>
       </w:r>
     </w:p>
     <w:p>

</xml_diff>